<commit_message>
fix: recreate Figure 2 architecture diagram with clean orthogonal routing matching reference paper
</commit_message>
<xml_diff>
--- a/VoicePrint_Academic_Project_Report.docx
+++ b/VoicePrint_Academic_Project_Report.docx
@@ -335,7 +335,7 @@
       <w:r>
         <w:drawing>
           <wp:inline xmlns:a="http://schemas.openxmlformats.org/drawingml/2006/main" xmlns:pic="http://schemas.openxmlformats.org/drawingml/2006/picture">
-            <wp:extent cx="5303520" cy="2196407"/>
+            <wp:extent cx="5303520" cy="2776061"/>
             <wp:docPr id="1" name="Picture 1"/>
             <wp:cNvGraphicFramePr>
               <a:graphicFrameLocks noChangeAspect="1"/>
@@ -356,7 +356,7 @@
                   <pic:spPr>
                     <a:xfrm>
                       <a:off x="0" y="0"/>
-                      <a:ext cx="5303520" cy="2196407"/>
+                      <a:ext cx="5303520" cy="2776061"/>
                     </a:xfrm>
                     <a:prstGeom prst="rect"/>
                   </pic:spPr>
@@ -669,7 +669,7 @@
       <w:r>
         <w:drawing>
           <wp:inline xmlns:a="http://schemas.openxmlformats.org/drawingml/2006/main" xmlns:pic="http://schemas.openxmlformats.org/drawingml/2006/picture">
-            <wp:extent cx="5303520" cy="2196407"/>
+            <wp:extent cx="5303520" cy="2541270"/>
             <wp:docPr id="2" name="Picture 2"/>
             <wp:cNvGraphicFramePr>
               <a:graphicFrameLocks noChangeAspect="1"/>
@@ -690,7 +690,7 @@
                   <pic:spPr>
                     <a:xfrm>
                       <a:off x="0" y="0"/>
-                      <a:ext cx="5303520" cy="2196407"/>
+                      <a:ext cx="5303520" cy="2541270"/>
                     </a:xfrm>
                     <a:prstGeom prst="rect"/>
                   </pic:spPr>

</xml_diff>